<commit_message>
docs(wetlab): we have PEG, no Ficoll; state phase 1 as reproduction only
Confirmed 25 September. Closes the open question that asked which crowders the
lab holds.

No effect on the first run, which contains no crowder either way, and the
README now says so explicitly: phase 1 is reproducing the dilute Fujii
oscillator, Stage 7 of the protocol is skipped.

Ficoll still matters for the project as a whole. The falsifiable claim is that
PEG stops the clock and Ficoll does not, so PEG alone gives a concentration
series rather than a comparison and cannot separate excluded volume from
chemistry. It is an ordinary catalogue reagent, so this is a purchasing
lead-time item, now recorded as one.

Still outstanding: the molecular weight of the PEG on the shelf. The model's
numbers are derived for PEG 8000 specifically and do not transfer.

Co-Authored-By: Claude Opus 5 <noreply@anthropic.com>
</commit_message>
<xml_diff>
--- a/wetlab/BIOMOD_2026_Project_Brief.docx
+++ b/wetlab/BIOMOD_2026_Project_Brief.docx
@@ -2210,13 +2210,61 @@
           <w:b/>
           <w:bCs/>
         </w:rPr>
-        <w:t xml:space="preserve">6. The crowders are not yet specified.</w:t>
-      </w:r>
-      <w:r>
-        <w:t xml:space="preserve"> </w:t>
-      </w:r>
-      <w:r>
-        <w:t xml:space="preserve">Ellie has PEG, but which molecular weight was never confirmed, and Ficoll was never confirmed as available at all. The model’s headline result is calculated for PEG 8000 and Ficoll 400. Without Ficoll there is nothing to compare PEG against, and the falsifiable claim evaporates.</w:t>
+        <w:t xml:space="preserve">6. We have PEG but no Ficoll.</w:t>
+      </w:r>
+      <w:r>
+        <w:t xml:space="preserve"> </w:t>
+      </w:r>
+      <w:r>
+        <w:t xml:space="preserve">Confirmed 25 September. The molecular weight of the PEG is still unconfirmed, and the model’s headline result is calculated for PEG</w:t>
+      </w:r>
+      <w:r>
+        <w:t xml:space="preserve"> </w:t>
+      </w:r>
+      <w:r>
+        <w:rPr>
+          <w:b/>
+          <w:bCs/>
+        </w:rPr>
+        <w:t xml:space="preserve">8000</w:t>
+      </w:r>
+      <w:r>
+        <w:t xml:space="preserve"> </w:t>
+      </w:r>
+      <w:r>
+        <w:t xml:space="preserve">specifically, so that needs checking on the bottle.</w:t>
+      </w:r>
+    </w:p>
+    <w:p>
+      <w:pPr>
+        <w:pStyle w:val="BodyText"/>
+      </w:pPr>
+      <w:r>
+        <w:t xml:space="preserve">This does not affect phase 1 at all. The reproduction run contains no crowder, so neither polymer is needed to start.</w:t>
+      </w:r>
+    </w:p>
+    <w:p>
+      <w:pPr>
+        <w:pStyle w:val="BodyText"/>
+      </w:pPr>
+      <w:r>
+        <w:t xml:space="preserve">It does matter for the project as a whole, because the falsifiable claim is that PEG stops the clock and Ficoll does not.</w:t>
+      </w:r>
+      <w:r>
+        <w:t xml:space="preserve"> </w:t>
+      </w:r>
+      <w:r>
+        <w:rPr>
+          <w:b/>
+          <w:bCs/>
+        </w:rPr>
+        <w:t xml:space="preserve">PEG alone gives a concentration series, not a comparison.</w:t>
+      </w:r>
+      <w:r>
+        <w:t xml:space="preserve"> </w:t>
+      </w:r>
+      <w:r>
+        <w:t xml:space="preserve">A PEG-only result is still a real finding, but it cannot separate excluded volume from chemistry, which is the interesting part. Ficoll 400 is an ordinary catalogue reagent, so this is a purchasing lead-time problem rather than a scientific one. Put it on an order list now and it will not be a problem in November.</w:t>
       </w:r>
     </w:p>
     <w:p>
@@ -12754,13 +12802,13 @@
           <w:b/>
           <w:bCs/>
         </w:rPr>
-        <w:t xml:space="preserve">Confirm which PEG the lab has</w:t>
-      </w:r>
-      <w:r>
-        <w:t xml:space="preserve"> </w:t>
-      </w:r>
-      <w:r>
-        <w:t xml:space="preserve">and whether Ficoll 400 is available at all. If the PEG is not 8000, the model’s excluded-volume term needs re-deriving. If there is no Ficoll, the central comparison has nothing to compare against.</w:t>
+        <w:t xml:space="preserve">Confirm the molecular weight of the PEG we hold.</w:t>
+      </w:r>
+      <w:r>
+        <w:t xml:space="preserve"> </w:t>
+      </w:r>
+      <w:r>
+        <w:t xml:space="preserve">If it is not 8000, the model’s excluded-volume term needs re-deriving. Not needed for the reproduction run, which has no crowder in it.</w:t>
       </w:r>
     </w:p>
     <w:p>
@@ -12776,13 +12824,10 @@
           <w:b/>
           <w:bCs/>
         </w:rPr>
-        <w:t xml:space="preserve">Decide on ET SSB.</w:t>
-      </w:r>
-      <w:r>
-        <w:t xml:space="preserve"> </w:t>
-      </w:r>
-      <w:r>
-        <w:t xml:space="preserve">In the buffer and out of the model, or out of both. Either is defensible; the current state is neither.</w:t>
+        <w:t xml:space="preserve">Order Ficoll 400</w:t>
+      </w:r>
+      <w:r>
+        <w:t xml:space="preserve">, on a timescale, not urgently. Confirmed 25 September: we have PEG, we do not have Ficoll. Irrelevant to phase 1 but it is the comparison arm of the whole project, so it needs ordering with lead time rather than discovering late. See the note below.</w:t>
       </w:r>
     </w:p>
     <w:p>
@@ -12798,22 +12843,13 @@
           <w:b/>
           <w:bCs/>
         </w:rPr>
-        <w:t xml:space="preserve">Aliquot the dNTPs</w:t>
-      </w:r>
-      <w:r>
-        <w:t xml:space="preserve"> </w:t>
-      </w:r>
-      <w:r>
-        <w:t xml:space="preserve">into single-run volumes to avoid repeated freeze-thaw. The tube holds enough for two or three runs.</w:t>
-      </w:r>
-    </w:p>
-    <w:bookmarkStart w:id="58" w:name="sources"/>
-    <w:p>
-      <w:pPr>
-        <w:pStyle w:val="Heading2"/>
-      </w:pPr>
-      <w:r>
-        <w:t xml:space="preserve">Sources</w:t>
+        <w:t xml:space="preserve">Decide on ET SSB.</w:t>
+      </w:r>
+      <w:r>
+        <w:t xml:space="preserve"> </w:t>
+      </w:r>
+      <w:r>
+        <w:t xml:space="preserve">In the buffer and out of the model, or out of both. Either is defensible; the current state is neither.</w:t>
       </w:r>
     </w:p>
     <w:p>
@@ -12825,20 +12861,26 @@
         </w:numPr>
       </w:pPr>
       <w:r>
-        <w:t xml:space="preserve">Fujii T. and Rondelez Y.,</w:t>
-      </w:r>
-      <w:r>
-        <w:t xml:space="preserve"> </w:t>
-      </w:r>
-      <w:r>
-        <w:rPr>
-          <w:i/>
-          <w:iCs/>
-        </w:rPr>
-        <w:t xml:space="preserve">Predator-prey molecular ecosystems</w:t>
-      </w:r>
-      <w:r>
-        <w:t xml:space="preserve">, ACS Nano 2013. Circuit, sequences, buffer, enzyme concentrations, 46.5 C protocol.</w:t>
+        <w:rPr>
+          <w:b/>
+          <w:bCs/>
+        </w:rPr>
+        <w:t xml:space="preserve">Aliquot the dNTPs</w:t>
+      </w:r>
+      <w:r>
+        <w:t xml:space="preserve"> </w:t>
+      </w:r>
+      <w:r>
+        <w:t xml:space="preserve">into single-run volumes to avoid repeated freeze-thaw. The tube holds enough for two or three runs.</w:t>
+      </w:r>
+    </w:p>
+    <w:bookmarkStart w:id="58" w:name="sources"/>
+    <w:p>
+      <w:pPr>
+        <w:pStyle w:val="Heading2"/>
+      </w:pPr>
+      <w:r>
+        <w:t xml:space="preserve">Sources</w:t>
       </w:r>
     </w:p>
     <w:p>
@@ -12846,11 +12888,24 @@
         <w:pStyle w:val="Compact"/>
         <w:numPr>
           <w:ilvl w:val="0"/>
-          <w:numId w:val="1015"/>
+          <w:numId w:val="1016"/>
         </w:numPr>
       </w:pPr>
       <w:r>
-        <w:t xml:space="preserve">Fujii et al. supplementary information. Table S5 constants, assembly protocol, data analysis. The substantive content is here rather than in the paper.</w:t>
+        <w:t xml:space="preserve">Fujii T. and Rondelez Y.,</w:t>
+      </w:r>
+      <w:r>
+        <w:t xml:space="preserve"> </w:t>
+      </w:r>
+      <w:r>
+        <w:rPr>
+          <w:i/>
+          <w:iCs/>
+        </w:rPr>
+        <w:t xml:space="preserve">Predator-prey molecular ecosystems</w:t>
+      </w:r>
+      <w:r>
+        <w:t xml:space="preserve">, ACS Nano 2013. Circuit, sequences, buffer, enzyme concentrations, 46.5 C protocol.</w:t>
       </w:r>
     </w:p>
     <w:p>
@@ -12858,11 +12913,11 @@
         <w:pStyle w:val="Compact"/>
         <w:numPr>
           <w:ilvl w:val="0"/>
-          <w:numId w:val="1015"/>
+          <w:numId w:val="1016"/>
         </w:numPr>
       </w:pPr>
       <w:r>
-        <w:t xml:space="preserve">YOKABIO 2025 wiki, https://yokabio2025.github.io/wiki/index.html. Same circuit at BIOMOD 2025, 3rd worldwide.</w:t>
+        <w:t xml:space="preserve">Fujii et al. supplementary information. Table S5 constants, assembly protocol, data analysis. The substantive content is here rather than in the paper.</w:t>
       </w:r>
     </w:p>
     <w:p>
@@ -12870,11 +12925,11 @@
         <w:pStyle w:val="Compact"/>
         <w:numPr>
           <w:ilvl w:val="0"/>
-          <w:numId w:val="1015"/>
+          <w:numId w:val="1016"/>
         </w:numPr>
       </w:pPr>
       <w:r>
-        <w:t xml:space="preserve">N-quenching paper. Documents which fluorophores work with nucleobase quenching: FAM, JOE, TAMRA, Alexa Fluor 594, DY-530, DY-636, DY-681.</w:t>
+        <w:t xml:space="preserve">YOKABIO 2025 wiki, https://yokabio2025.github.io/wiki/index.html. Same circuit at BIOMOD 2025, 3rd worldwide.</w:t>
       </w:r>
     </w:p>
     <w:p>
@@ -12882,35 +12937,11 @@
         <w:pStyle w:val="Compact"/>
         <w:numPr>
           <w:ilvl w:val="0"/>
-          <w:numId w:val="1015"/>
+          <w:numId w:val="1016"/>
         </w:numPr>
       </w:pPr>
       <w:r>
-        <w:rPr>
-          <w:rStyle w:val="VerbatimChar"/>
-        </w:rPr>
-        <w:t xml:space="preserve">crowded_mechanistic.py</w:t>
-      </w:r>
-      <w:r>
-        <w:t xml:space="preserve"> </w:t>
-      </w:r>
-      <w:r>
-        <w:t xml:space="preserve">and</w:t>
-      </w:r>
-      <w:r>
-        <w:t xml:space="preserve"> </w:t>
-      </w:r>
-      <w:r>
-        <w:rPr>
-          <w:rStyle w:val="VerbatimChar"/>
-        </w:rPr>
-        <w:t xml:space="preserve">Crowded_PredatorPrey_Mechanistic_Model.docx</w:t>
-      </w:r>
-      <w:r>
-        <w:t xml:space="preserve"> </w:t>
-      </w:r>
-      <w:r>
-        <w:t xml:space="preserve">in the BIOMOD repo. The seven-species model, its physical channels, and the derivation of every constant.</w:t>
+        <w:t xml:space="preserve">N-quenching paper. Documents which fluorophores work with nucleobase quenching: FAM, JOE, TAMRA, Alexa Fluor 594, DY-530, DY-636, DY-681.</w:t>
       </w:r>
     </w:p>
     <w:p>
@@ -12918,7 +12949,43 @@
         <w:pStyle w:val="Compact"/>
         <w:numPr>
           <w:ilvl w:val="0"/>
-          <w:numId w:val="1015"/>
+          <w:numId w:val="1016"/>
+        </w:numPr>
+      </w:pPr>
+      <w:r>
+        <w:rPr>
+          <w:rStyle w:val="VerbatimChar"/>
+        </w:rPr>
+        <w:t xml:space="preserve">crowded_mechanistic.py</w:t>
+      </w:r>
+      <w:r>
+        <w:t xml:space="preserve"> </w:t>
+      </w:r>
+      <w:r>
+        <w:t xml:space="preserve">and</w:t>
+      </w:r>
+      <w:r>
+        <w:t xml:space="preserve"> </w:t>
+      </w:r>
+      <w:r>
+        <w:rPr>
+          <w:rStyle w:val="VerbatimChar"/>
+        </w:rPr>
+        <w:t xml:space="preserve">Crowded_PredatorPrey_Mechanistic_Model.docx</w:t>
+      </w:r>
+      <w:r>
+        <w:t xml:space="preserve"> </w:t>
+      </w:r>
+      <w:r>
+        <w:t xml:space="preserve">in the BIOMOD repo. The seven-species model, its physical channels, and the derivation of every constant.</w:t>
+      </w:r>
+    </w:p>
+    <w:p>
+      <w:pPr>
+        <w:pStyle w:val="Compact"/>
+        <w:numPr>
+          <w:ilvl w:val="0"/>
+          <w:numId w:val="1016"/>
         </w:numPr>
       </w:pPr>
       <w:r>
@@ -13403,6 +13470,9 @@
     <w:abstractNumId w:val="992"/>
   </w:num>
   <w:num w:numId="1015">
+    <w:abstractNumId w:val="992"/>
+  </w:num>
+  <w:num w:numId="1016">
     <w:abstractNumId w:val="991"/>
   </w:num>
 </w:numbering>

</xml_diff>